<commit_message>
docs: add Phase 1 dashboard recreation guide with source and manifests
Co-authored-by: Cursor <cursoragent@cursor.com>
</commit_message>
<xml_diff>
--- a/docs/Homelab-Dashboard-Phase-1.docx
+++ b/docs/Homelab-Dashboard-Phase-1.docx
@@ -517,6 +517,19 @@
         <w:t>End of Phase 1 record. Appendix A is the optional follow-up completed on 13 September 2026.</w:t>
       </w:r>
     </w:p>
+    <w:p>
+      <w:pPr>
+        <w:pStyle w:val="Heading1"/>
+      </w:pPr>
+      <w:r>
+        <w:t>Related document</w:t>
+      </w:r>
+    </w:p>
+    <w:p>
+      <w:r>
+        <w:t>To recreate the application from files and commands, use docs/Homelab-Dashboard-Phase-1-Implementation.docx (application source, Kubernetes manifests, SOPS/Flux/kubectl steps).</w:t>
+      </w:r>
+    </w:p>
     <w:sectPr>
       <w:pgSz w:w="12240" w:h="15840"/>
       <w:pgMar w:top="1440" w:right="1440" w:bottom="1440" w:left="1440" w:header="720" w:footer="720" w:gutter="0"/>

</xml_diff>